<commit_message>
fix(deploy): move the database off Render's expiring free tier to Neon
Render deletes a free PostgreSQL 30 days after creation, which takes the API
down with it because migrations run at start-up, and replacing it requires a
paid plan. The Blueprint no longer defines a database; DATABASE_URL is
supplied as a secret, so any provider works. Neon's free plan is permanent,
needs no payment card and carries pgvector.

Verified against a non-superuser database, as managed providers enforce:
migration 003 fails with 'permission denied to create extension vector'
unless the extension is created once by the database owner, after which all
24 tables are created cleanly. The migration runner now detects that error
and prints the exact command to run.

Guide, report, diagrams and traceability updated; the two older runbooks are
marked superseded. 193 tests pass.
</commit_message>
<xml_diff>
--- a/docs/BCSE408L_Final_Project_Report.docx
+++ b/docs/BCSE408L_Final_Project_Report.docx
@@ -624,7 +624,7 @@
           <w:sz w:val="21"/>
           <w:szCs w:val="21"/>
         </w:rPr>
-        <w:t xml:space="preserve">The application is deployed on public cloud infrastructure: the React frontend on Vercel's global CDN, the Express/TypeScript API and a managed PostgreSQL 16 instance on Render, provisioned from a version-controlled Blueprint. Correctness is evidenced by 193 automated tests executed against a real PostgreSQL database using the production migration files, all passing, and run by continuous integration on every push.</w:t>
+        <w:t xml:space="preserve">The application is deployed on public cloud infrastructure: the React frontend on Vercel's global CDN, the Express/TypeScript API on Render from a version-controlled Blueprint, and a managed PostgreSQL instance on Neon. Correctness is evidenced by 193 automated tests executed against a real PostgreSQL database using the production migration files, all passing, and run by continuous integration on every push.</w:t>
       </w:r>
     </w:p>
     <w:p>
@@ -8010,7 +8010,7 @@
       <w:r>
         <w:drawing>
           <wp:inline distT="0" distB="0" distL="0" distR="0">
-            <wp:extent cx="5715000" cy="2876550"/>
+            <wp:extent cx="5715000" cy="2905125"/>
             <wp:effectExtent t="0" r="0" b="0" l="0"/>
             <wp:docPr id="1" name=""/>
             <wp:cNvGraphicFramePr>
@@ -8035,7 +8035,7 @@
                   <pic:spPr bwMode="auto">
                     <a:xfrm>
                       <a:off x="0" y="0"/>
-                      <a:ext cx="5715000" cy="2876550"/>
+                      <a:ext cx="5715000" cy="2905125"/>
                     </a:xfrm>
                     <a:prstGeom prst="rect">
                       <a:avLst/>
@@ -8781,7 +8781,7 @@
       <w:r>
         <w:drawing>
           <wp:inline distT="0" distB="0" distL="0" distR="0">
-            <wp:extent cx="5524500" cy="4295775"/>
+            <wp:extent cx="5524500" cy="5591175"/>
             <wp:effectExtent t="0" r="0" b="0" l="0"/>
             <wp:docPr id="2" name=""/>
             <wp:cNvGraphicFramePr>
@@ -8806,7 +8806,7 @@
                   <pic:spPr bwMode="auto">
                     <a:xfrm>
                       <a:off x="0" y="0"/>
-                      <a:ext cx="5524500" cy="4295775"/>
+                      <a:ext cx="5524500" cy="5591175"/>
                     </a:xfrm>
                     <a:prstGeom prst="rect">
                       <a:avLst/>
@@ -9189,7 +9189,7 @@
                 <w:sz w:val="19"/>
                 <w:szCs w:val="19"/>
               </w:rPr>
-              <w:t xml:space="preserve">Render Web Service (Singapore)</w:t>
+              <w:t xml:space="preserve">Render Web Service</w:t>
             </w:r>
           </w:p>
         </w:tc>
@@ -9255,7 +9255,7 @@
                 <w:sz w:val="19"/>
                 <w:szCs w:val="19"/>
               </w:rPr>
-              <w:t xml:space="preserve">The platform owns the Node runtime, TLS termination and restarts; supports infrastructure as code; Singapore is the nearest region to India on the permitted list</w:t>
+              <w:t xml:space="preserve">The platform owns the Node runtime, TLS termination and restarts, and supports infrastructure as code; its free web service requires no payment card</w:t>
             </w:r>
           </w:p>
         </w:tc>
@@ -9321,7 +9321,7 @@
                 <w:sz w:val="19"/>
                 <w:szCs w:val="19"/>
               </w:rPr>
-              <w:t xml:space="preserve">Render PostgreSQL 16</w:t>
+              <w:t xml:space="preserve">Neon serverless PostgreSQL</w:t>
             </w:r>
           </w:p>
         </w:tc>
@@ -9385,7 +9385,7 @@
                 <w:sz w:val="19"/>
                 <w:szCs w:val="19"/>
               </w:rPr>
-              <w:t xml:space="preserve">Managed backups, SSL and connection limits, with the pgvector extension available; same region and private network as the API</w:t>
+              <w:t xml:space="preserve">A permanently free plan requiring no payment card, carrying the pgvector extension this project needs, with TLS and compute that suspends when idle</w:t>
             </w:r>
           </w:p>
         </w:tc>
@@ -9872,7 +9872,7 @@
           <w:sz w:val="21"/>
           <w:szCs w:val="21"/>
         </w:rPr>
-        <w:t xml:space="preserve">The database accepts connections only over the provider’s private network; the API uses the internal connection string over SSL.</w:t>
+        <w:t xml:space="preserve">The database is reached only over TLS, using a connection string held as a platform secret that is never committed to the repository.</w:t>
       </w:r>
     </w:p>
     <w:p>
@@ -16845,7 +16845,7 @@
           <w:sz w:val="21"/>
           <w:szCs w:val="21"/>
         </w:rPr>
-        <w:t xml:space="preserve">The Blueprint is applied from the repository, creating the managed PostgreSQL instance and the API web service in the same region, generating the session signing secrets and wiring the database connection string automatically.</w:t>
+        <w:t xml:space="preserve">The database is created first on Neon, and its connection string is supplied to the Blueprint as a secret. The Blueprint is then applied from the repository, creating the API web service and generating the session signing secrets.</w:t>
       </w:r>
     </w:p>
     <w:p>
@@ -17420,7 +17420,7 @@
                 <w:sz w:val="19"/>
                 <w:szCs w:val="19"/>
               </w:rPr>
-              <w:t xml:space="preserve">The free managed database expired after thirty days, taking the API down with it</w:t>
+              <w:t xml:space="preserve">The hosting provider’s free managed database is deleted thirty days after creation, taking the API down with it because migrations run at start-up, and replacing it requires a paid plan</w:t>
             </w:r>
           </w:p>
         </w:tc>
@@ -17453,7 +17453,7 @@
                 <w:sz w:val="19"/>
                 <w:szCs w:val="19"/>
               </w:rPr>
-              <w:t xml:space="preserve">A replacement instance was provisioned and the schema re-applied automatically on start; the expiry is now documented in the deployment runbook</w:t>
+              <w:t xml:space="preserve">The database was moved to a provider whose free plan is permanent and carries the required vector extension. Only the connection string changed: the application reads a connection string and does not depend on which provider issued it</w:t>
             </w:r>
           </w:p>
         </w:tc>
@@ -17796,7 +17796,7 @@
                 <w:sz w:val="19"/>
                 <w:szCs w:val="19"/>
               </w:rPr>
-              <w:t xml:space="preserve">Managed PostgreSQL 16 with pgvector (Render, Singapore)</w:t>
+              <w:t xml:space="preserve">Neon serverless PostgreSQL with pgvector</w:t>
             </w:r>
           </w:p>
         </w:tc>

</xml_diff>

<commit_message>
docs: record the live deployment and finalise the submission report
Database on Neon (free, permanent, pgvector), API on Render, frontend on
Vercel. Verified before any document was changed: health with the database
connected, CORS, the deployed bundle targeting the current API, and all three
report credentials returning 200.

Screenshots recaptured from the live site, including the developer console
showing an issued API key whose last-used timestamp records a real call to
the public API.
</commit_message>
<xml_diff>
--- a/docs/BCSE408L_Final_Project_Report.docx
+++ b/docs/BCSE408L_Final_Project_Report.docx
@@ -339,7 +339,7 @@
                 <w:sz w:val="19"/>
                 <w:szCs w:val="19"/>
               </w:rPr>
-              <w:t xml:space="preserve">Dr. M Dinakaran / TO BE CONFIRMED</w:t>
+              <w:t xml:space="preserve">Dr. M Dinakaran / D1+TD1</w:t>
             </w:r>
           </w:p>
         </w:tc>
@@ -406,7 +406,7 @@
                 <w:sz w:val="19"/>
                 <w:szCs w:val="19"/>
               </w:rPr>
-              <w:t xml:space="preserve">PENDING_DEPLOYMENT</w:t>
+              <w:t xml:space="preserve">https://servicedesk-ai-two.vercel.app</w:t>
             </w:r>
           </w:p>
         </w:tc>
@@ -12213,7 +12213,7 @@
           <w:sz w:val="21"/>
           <w:szCs w:val="21"/>
         </w:rPr>
-        <w:t xml:space="preserve">The interface is built on a hand-written design system rather than a component library: one accent colour, a neutral palette, consistent cards and tables, and explicit loading, empty and error states on every data view. It is responsive from 375 pixels, verified at phone, tablet and desktop widths. The screenshots below were captured from the deployed application.</w:t>
+        <w:t xml:space="preserve">The interface is built on a hand-written design system rather than a component library: one accent colour, a neutral palette, consistent cards and tables, and explicit loading, empty and error states on every data view. It is responsive from 375 pixels, verified at phone, tablet and desktop widths. The screenshots below were captured from the deployed application at the live URL given in section 21, showing real data from the cloud database.</w:t>
       </w:r>
     </w:p>
     <w:p>
@@ -12476,7 +12476,7 @@
       <w:r>
         <w:drawing>
           <wp:inline distT="0" distB="0" distL="0" distR="0">
-            <wp:extent cx="5334000" cy="6438900"/>
+            <wp:extent cx="5334000" cy="5867400"/>
             <wp:effectExtent t="0" r="0" b="0" l="0"/>
             <wp:docPr id="8" name=""/>
             <wp:cNvGraphicFramePr>
@@ -12501,7 +12501,7 @@
                   <pic:spPr bwMode="auto">
                     <a:xfrm>
                       <a:off x="0" y="0"/>
-                      <a:ext cx="5334000" cy="6438900"/>
+                      <a:ext cx="5334000" cy="5867400"/>
                     </a:xfrm>
                     <a:prstGeom prst="rect">
                       <a:avLst/>
@@ -12539,7 +12539,7 @@
       <w:r>
         <w:drawing>
           <wp:inline distT="0" distB="0" distL="0" distR="0">
-            <wp:extent cx="5334000" cy="6200775"/>
+            <wp:extent cx="5334000" cy="6086475"/>
             <wp:effectExtent t="0" r="0" b="0" l="0"/>
             <wp:docPr id="9" name=""/>
             <wp:cNvGraphicFramePr>
@@ -12564,7 +12564,7 @@
                   <pic:spPr bwMode="auto">
                     <a:xfrm>
                       <a:off x="0" y="0"/>
-                      <a:ext cx="5334000" cy="6200775"/>
+                      <a:ext cx="5334000" cy="6086475"/>
                     </a:xfrm>
                     <a:prstGeom prst="rect">
                       <a:avLst/>
@@ -12602,7 +12602,7 @@
       <w:r>
         <w:drawing>
           <wp:inline distT="0" distB="0" distL="0" distR="0">
-            <wp:extent cx="5334000" cy="3514725"/>
+            <wp:extent cx="5334000" cy="3314700"/>
             <wp:effectExtent t="0" r="0" b="0" l="0"/>
             <wp:docPr id="10" name=""/>
             <wp:cNvGraphicFramePr>
@@ -12627,7 +12627,7 @@
                   <pic:spPr bwMode="auto">
                     <a:xfrm>
                       <a:off x="0" y="0"/>
-                      <a:ext cx="5334000" cy="3514725"/>
+                      <a:ext cx="5334000" cy="3314700"/>
                     </a:xfrm>
                     <a:prstGeom prst="rect">
                       <a:avLst/>
@@ -12665,7 +12665,7 @@
       <w:r>
         <w:drawing>
           <wp:inline distT="0" distB="0" distL="0" distR="0">
-            <wp:extent cx="5334000" cy="3514725"/>
+            <wp:extent cx="5334000" cy="3314700"/>
             <wp:effectExtent t="0" r="0" b="0" l="0"/>
             <wp:docPr id="11" name=""/>
             <wp:cNvGraphicFramePr>
@@ -12690,7 +12690,7 @@
                   <pic:spPr bwMode="auto">
                     <a:xfrm>
                       <a:off x="0" y="0"/>
-                      <a:ext cx="5334000" cy="3514725"/>
+                      <a:ext cx="5334000" cy="3314700"/>
                     </a:xfrm>
                     <a:prstGeom prst="rect">
                       <a:avLst/>
@@ -12791,7 +12791,7 @@
       <w:r>
         <w:drawing>
           <wp:inline distT="0" distB="0" distL="0" distR="0">
-            <wp:extent cx="2381250" cy="5153025"/>
+            <wp:extent cx="5334000" cy="3514725"/>
             <wp:effectExtent t="0" r="0" b="0" l="0"/>
             <wp:docPr id="13" name=""/>
             <wp:cNvGraphicFramePr>
@@ -12816,7 +12816,7 @@
                   <pic:spPr bwMode="auto">
                     <a:xfrm>
                       <a:off x="0" y="0"/>
-                      <a:ext cx="2381250" cy="5153025"/>
+                      <a:ext cx="5334000" cy="3514725"/>
                     </a:xfrm>
                     <a:prstGeom prst="rect">
                       <a:avLst/>
@@ -12843,7 +12843,7 @@
           <w:sz w:val="18"/>
           <w:szCs w:val="18"/>
         </w:rPr>
-        <w:t xml:space="preserve">Figure 13.10 — Responsive layout at 390 pixels</w:t>
+        <w:t xml:space="preserve">Figure 13.10 — Developer console: an issued API key, whose “last used” timestamp records a successful call to the public API, and a registered webhook endpoint</w:t>
       </w:r>
     </w:p>
     <w:p>
@@ -12854,7 +12854,7 @@
       <w:r>
         <w:drawing>
           <wp:inline distT="0" distB="0" distL="0" distR="0">
-            <wp:extent cx="5334000" cy="3314700"/>
+            <wp:extent cx="2381250" cy="5153025"/>
             <wp:effectExtent t="0" r="0" b="0" l="0"/>
             <wp:docPr id="14" name=""/>
             <wp:cNvGraphicFramePr>
@@ -12879,6 +12879,69 @@
                   <pic:spPr bwMode="auto">
                     <a:xfrm>
                       <a:off x="0" y="0"/>
+                      <a:ext cx="2381250" cy="5153025"/>
+                    </a:xfrm>
+                    <a:prstGeom prst="rect">
+                      <a:avLst/>
+                    </a:prstGeom>
+                  </pic:spPr>
+                </pic:pic>
+              </a:graphicData>
+            </a:graphic>
+          </wp:inline>
+        </w:drawing>
+      </w:r>
+    </w:p>
+    <w:p>
+      <w:pPr>
+        <w:spacing w:after="200" w:before="60"/>
+        <w:jc w:val="center"/>
+      </w:pPr>
+      <w:r>
+        <w:rPr>
+          <w:rFonts w:ascii="Calibri" w:cs="Calibri" w:eastAsia="Calibri" w:hAnsi="Calibri"/>
+          <w:i/>
+          <w:iCs/>
+          <w:color w:val="6B7280"/>
+          <w:sz w:val="18"/>
+          <w:szCs w:val="18"/>
+        </w:rPr>
+        <w:t xml:space="preserve">Figure 13.11 — Responsive layout at 390 pixels</w:t>
+      </w:r>
+    </w:p>
+    <w:p>
+      <w:pPr>
+        <w:spacing w:after="40" w:before="110"/>
+        <w:jc w:val="center"/>
+      </w:pPr>
+      <w:r>
+        <w:drawing>
+          <wp:inline distT="0" distB="0" distL="0" distR="0">
+            <wp:extent cx="5334000" cy="3314700"/>
+            <wp:effectExtent t="0" r="0" b="0" l="0"/>
+            <wp:docPr id="15" name=""/>
+            <wp:cNvGraphicFramePr>
+              <a:graphicFrameLocks xmlns:a="http://schemas.openxmlformats.org/drawingml/2006/main" noChangeAspect="1"/>
+            </wp:cNvGraphicFramePr>
+            <a:graphic xmlns:a="http://schemas.openxmlformats.org/drawingml/2006/main">
+              <a:graphicData uri="http://schemas.openxmlformats.org/drawingml/2006/picture">
+                <pic:pic xmlns:pic="http://schemas.openxmlformats.org/drawingml/2006/picture">
+                  <pic:nvPicPr>
+                    <pic:cNvPr id="0" name="" descr=""/>
+                    <pic:cNvPicPr>
+                      <a:picLocks noChangeAspect="1" noChangeArrowheads="1"/>
+                    </pic:cNvPicPr>
+                  </pic:nvPicPr>
+                  <pic:blipFill>
+                    <a:blip r:embed="rId23" cstate="none"/>
+                    <a:srcRect/>
+                    <a:stretch>
+                      <a:fillRect/>
+                    </a:stretch>
+                  </pic:blipFill>
+                  <pic:spPr bwMode="auto">
+                    <a:xfrm>
+                      <a:off x="0" y="0"/>
                       <a:ext cx="5334000" cy="3314700"/>
                     </a:xfrm>
                     <a:prstGeom prst="rect">
@@ -12906,7 +12969,7 @@
           <w:sz w:val="18"/>
           <w:szCs w:val="18"/>
         </w:rPr>
-        <w:t xml:space="preserve">Figure 13.11 — Interactive API documentation generated from the validation schemas</w:t>
+        <w:t xml:space="preserve">Figure 13.12 — Interactive API documentation generated from the validation schemas</w:t>
       </w:r>
     </w:p>
     <w:p>
@@ -17595,7 +17658,7 @@
                 <w:sz w:val="19"/>
                 <w:szCs w:val="19"/>
               </w:rPr>
-              <w:t xml:space="preserve">PENDING_DEPLOYMENT</w:t>
+              <w:t xml:space="preserve">https://servicedesk-ai-two.vercel.app</w:t>
             </w:r>
           </w:p>
         </w:tc>
@@ -17662,7 +17725,7 @@
                 <w:sz w:val="19"/>
                 <w:szCs w:val="19"/>
               </w:rPr>
-              <w:t xml:space="preserve">PENDING_DEPLOYMENT/api</w:t>
+              <w:t xml:space="preserve">https://servicedesk-api-cea6.onrender.com/api</w:t>
             </w:r>
           </w:p>
         </w:tc>
@@ -17729,7 +17792,7 @@
                 <w:sz w:val="19"/>
                 <w:szCs w:val="19"/>
               </w:rPr>
-              <w:t xml:space="preserve">PENDING_DEPLOYMENT/api/docs</w:t>
+              <w:t xml:space="preserve">https://servicedesk-api-cea6.onrender.com/api/docs</w:t>
             </w:r>
           </w:p>
         </w:tc>
@@ -20264,7 +20327,7 @@
                 <w:sz w:val="19"/>
                 <w:szCs w:val="19"/>
               </w:rPr>
-              <w:t xml:space="preserve">PENDING_DEPLOYMENT</w:t>
+              <w:t xml:space="preserve">https://servicedesk-ai-two.vercel.app</w:t>
             </w:r>
           </w:p>
         </w:tc>
@@ -21067,7 +21130,7 @@
                 <w:sz w:val="19"/>
                 <w:szCs w:val="19"/>
               </w:rPr>
-              <w:t xml:space="preserve">PENDING_DEPLOYMENT</w:t>
+              <w:t xml:space="preserve">https://servicedesk-ai-two.vercel.app</w:t>
             </w:r>
           </w:p>
         </w:tc>

</xml_diff>